<commit_message>
Updating the "About" page
</commit_message>
<xml_diff>
--- a/resources/pdfs/Genetic-Counselor-leaders.docx
+++ b/resources/pdfs/Genetic-Counselor-leaders.docx
@@ -584,7 +584,13 @@
         <w:t>EHR</w:t>
       </w:r>
       <w:r>
-        <w:t xml:space="preserve">. Patient outreach and education occur through a customizable chatbot. </w:t>
+        <w:t xml:space="preserve">. Patient outreach and education </w:t>
+      </w:r>
+      <w:r>
+        <w:t xml:space="preserve">can </w:t>
+      </w:r>
+      <w:r>
+        <w:t xml:space="preserve">occur through a customizable chatbot. </w:t>
       </w:r>
       <w:r>
         <w:t>U</w:t>

</xml_diff>